<commit_message>
Added excel file where i will record my data
</commit_message>
<xml_diff>
--- a/Dear Data 100 Project.docx
+++ b/Dear Data 100 Project.docx
@@ -699,7 +699,21 @@
           <w:sz w:val="28"/>
           <w:szCs w:val="28"/>
         </w:rPr>
-        <w:t xml:space="preserve"> Giorgia has her data easily categorised while Stefanie doesn’t really have specific data, however her’s is easier to understand, and you can clearly see how what she felt at what time during the week. I chose week 11 to try get ideas on how to present my idea, do I put it in a line? Should I box it all up?</w:t>
+        <w:t xml:space="preserve"> Giorgia has her data easily categorised while Stefanie doesn’t really have specific data, however </w:t>
+      </w:r>
+      <w:r>
+        <w:rPr>
+          <w:sz w:val="28"/>
+          <w:szCs w:val="28"/>
+        </w:rPr>
+        <w:t>Her’s</w:t>
+      </w:r>
+      <w:r>
+        <w:rPr>
+          <w:sz w:val="28"/>
+          <w:szCs w:val="28"/>
+        </w:rPr>
+        <w:t xml:space="preserve"> is easier to understand, and you can clearly see how what she felt at what time during the week. I chose week 11 to try get ideas on how to present my idea, do I put it in a line? Should I box it all up?</w:t>
       </w:r>
     </w:p>
     <w:p>
@@ -890,6 +904,118 @@
         <w:br/>
         <w:t>After that, I would start finding patterns and then start rough sketches of visualising my data, then move to the final sketch and then create the instructions to read my data.</w:t>
       </w:r>
+    </w:p>
+    <w:p>
+      <w:pPr>
+        <w:rPr>
+          <w:sz w:val="28"/>
+          <w:szCs w:val="28"/>
+        </w:rPr>
+      </w:pPr>
+      <w:r>
+        <w:rPr>
+          <w:sz w:val="28"/>
+          <w:szCs w:val="28"/>
+        </w:rPr>
+        <w:t>Overall, we need to answer have a bunch of broken-down questions from our main question.</w:t>
+      </w:r>
+      <w:r>
+        <w:rPr>
+          <w:sz w:val="28"/>
+          <w:szCs w:val="28"/>
+        </w:rPr>
+        <w:br/>
+        <w:t xml:space="preserve">Our main question </w:t>
+      </w:r>
+      <w:r>
+        <w:rPr>
+          <w:sz w:val="28"/>
+          <w:szCs w:val="28"/>
+        </w:rPr>
+        <w:t>is -</w:t>
+      </w:r>
+      <w:r>
+        <w:rPr>
+          <w:sz w:val="28"/>
+          <w:szCs w:val="28"/>
+        </w:rPr>
+        <w:t xml:space="preserve"> “How angry do I get while playing Valorant?”</w:t>
+      </w:r>
+      <w:r>
+        <w:rPr>
+          <w:sz w:val="28"/>
+          <w:szCs w:val="28"/>
+        </w:rPr>
+        <w:br/>
+        <w:t>Data questions:</w:t>
+      </w:r>
+      <w:r>
+        <w:rPr>
+          <w:sz w:val="28"/>
+          <w:szCs w:val="28"/>
+        </w:rPr>
+        <w:br/>
+        <w:t>“</w:t>
+      </w:r>
+      <w:r>
+        <w:rPr>
+          <w:sz w:val="28"/>
+          <w:szCs w:val="28"/>
+        </w:rPr>
+        <w:t>What round did I get angry?</w:t>
+      </w:r>
+      <w:r>
+        <w:rPr>
+          <w:sz w:val="28"/>
+          <w:szCs w:val="28"/>
+        </w:rPr>
+        <w:t>” – “Why did I get angry?” - “How angry did I get?”</w:t>
+      </w:r>
+      <w:r>
+        <w:rPr>
+          <w:sz w:val="28"/>
+          <w:szCs w:val="28"/>
+        </w:rPr>
+        <w:br/>
+        <w:t xml:space="preserve">“When did I get angry” – “Were we winning or losing?” – “How many times did I get angry while playing a game?” – “Did we win the game or lose?” </w:t>
+      </w:r>
+      <w:r>
+        <w:rPr>
+          <w:sz w:val="28"/>
+          <w:szCs w:val="28"/>
+        </w:rPr>
+        <w:t>–</w:t>
+      </w:r>
+      <w:r>
+        <w:rPr>
+          <w:sz w:val="28"/>
+          <w:szCs w:val="28"/>
+        </w:rPr>
+        <w:t xml:space="preserve"> </w:t>
+      </w:r>
+      <w:r>
+        <w:rPr>
+          <w:sz w:val="28"/>
+          <w:szCs w:val="28"/>
+        </w:rPr>
+        <w:t>“What map and agent?” – “Whose fault was it?” – “What happened/What I did?”</w:t>
+      </w:r>
+      <w:r>
+        <w:rPr>
+          <w:sz w:val="28"/>
+          <w:szCs w:val="28"/>
+        </w:rPr>
+        <w:br/>
+        <w:t>Then we can add any notes later if needed.</w:t>
+      </w:r>
+    </w:p>
+    <w:p>
+      <w:pPr>
+        <w:rPr>
+          <w:sz w:val="28"/>
+          <w:szCs w:val="28"/>
+        </w:rPr>
+      </w:pPr>
     </w:p>
     <w:sectPr>
       <w:pgSz w:w="11906" w:h="16838"/>

</xml_diff>